<commit_message>
Content Pipeline Starter: simplify - Arial, bold labels (no outline), numbered skills; same Drive link
</commit_message>
<xml_diff>
--- a/youtube/_resources/The Content Pipeline Starter.docx
+++ b/youtube/_resources/The Content Pipeline Starter.docx
@@ -2,21 +2,16 @@
 <file path=word/document.xml><?xml version="1.0" encoding="utf-8"?>
 <w:document xmlns:w="http://schemas.openxmlformats.org/wordprocessingml/2006/main" xmlns:m="http://schemas.openxmlformats.org/officeDocument/2006/math" xmlns:r="http://schemas.openxmlformats.org/officeDocument/2006/relationships" xmlns:o="urn:schemas-microsoft-com:office:office" xmlns:v="urn:schemas-microsoft-com:vml" xmlns:w10="urn:schemas-microsoft-com:office:word" xmlns:a="http://schemas.openxmlformats.org/drawingml/2006/main" xmlns:pic="http://schemas.openxmlformats.org/drawingml/2006/picture" xmlns:wp="http://schemas.openxmlformats.org/drawingml/2006/wordprocessingDrawing">
   <w:body>
-    <w:bookmarkStart w:id="25" w:name="the-content-pipeline-starter-video-1"/>
-    <w:p>
-      <w:pPr>
-        <w:pStyle w:val="Heading1"/>
-      </w:pPr>
-      <w:r>
-        <w:t xml:space="preserve">The Content Pipeline Starter (Video 1)</w:t>
-      </w:r>
-    </w:p>
     <w:p>
       <w:pPr>
         <w:pStyle w:val="FirstParagraph"/>
       </w:pPr>
       <w:r>
-        <w:t xml:space="preserve">Everything I use to turn one afternoon into a full week of content. Copy what’s useful, build your first skill this week.</w:t>
+        <w:rPr>
+          <w:b/>
+          <w:bCs/>
+        </w:rPr>
+        <w:t xml:space="preserve">The Content Pipeline Starter</w:t>
       </w:r>
     </w:p>
     <w:p>
@@ -24,16 +19,47 @@
         <w:pStyle w:val="BodyText"/>
       </w:pPr>
       <w:r>
-        <w:t xml:space="preserve">Free pack + newsletter (I break this down every week): https://free.tylerai.dev/youtube/</w:t>
-      </w:r>
-    </w:p>
-    <w:bookmarkStart w:id="20" w:name="what-you-get-from-this"/>
-    <w:p>
-      <w:pPr>
-        <w:pStyle w:val="Heading2"/>
-      </w:pPr>
-      <w:r>
-        <w:t xml:space="preserve">What you get from this</w:t>
+        <w:t xml:space="preserve">Everything I use to turn one afternoon into a full week of content. Copy what is useful, and build your first skill this week.</w:t>
+      </w:r>
+    </w:p>
+    <w:p>
+      <w:pPr>
+        <w:pStyle w:val="BodyText"/>
+      </w:pPr>
+      <w:r>
+        <w:t xml:space="preserve">Free pack + newsletter: https://free.tylerai.dev/youtube/</w:t>
+      </w:r>
+    </w:p>
+    <w:p>
+      <w:pPr>
+        <w:pStyle w:val="BodyText"/>
+      </w:pPr>
+      <w:r>
+        <w:rPr>
+          <w:b/>
+          <w:bCs/>
+        </w:rPr>
+        <w:t xml:space="preserve">What a skill is</w:t>
+      </w:r>
+    </w:p>
+    <w:p>
+      <w:pPr>
+        <w:pStyle w:val="BodyText"/>
+      </w:pPr>
+      <w:r>
+        <w:t xml:space="preserve">A skill is a workflow you taught Claude Code once, triggered with one command. Build it once, run it forever.</w:t>
+      </w:r>
+    </w:p>
+    <w:p>
+      <w:pPr>
+        <w:pStyle w:val="BodyText"/>
+      </w:pPr>
+      <w:r>
+        <w:rPr>
+          <w:b/>
+          <w:bCs/>
+        </w:rPr>
+        <w:t xml:space="preserve">The skills I use in this video</w:t>
       </w:r>
     </w:p>
     <w:p>
@@ -45,7 +71,7 @@
         </w:numPr>
       </w:pPr>
       <w:r>
-        <w:t xml:space="preserve">The exact skills that produce my channel</w:t>
+        <w:t xml:space="preserve">/yt-search - researches what is working on YouTube for a topic, ranks by views</w:t>
       </w:r>
     </w:p>
     <w:p>
@@ -57,25 +83,7 @@
         </w:numPr>
       </w:pPr>
       <w:r>
-        <w:t xml:space="preserve">How a</w:t>
-      </w:r>
-      <w:r>
-        <w:t xml:space="preserve"> </w:t>
-      </w:r>
-      <w:r>
-        <w:t xml:space="preserve">“</w:t>
-      </w:r>
-      <w:r>
-        <w:t xml:space="preserve">skill</w:t>
-      </w:r>
-      <w:r>
-        <w:t xml:space="preserve">”</w:t>
-      </w:r>
-      <w:r>
-        <w:t xml:space="preserve"> </w:t>
-      </w:r>
-      <w:r>
-        <w:t xml:space="preserve">works so you can build your own</w:t>
+        <w:t xml:space="preserve">/yt-deep-research - searches YouTube, transcribes the top videos, deep analysis of hooks and structure</w:t>
       </w:r>
     </w:p>
     <w:p>
@@ -87,17 +95,79 @@
         </w:numPr>
       </w:pPr>
       <w:r>
-        <w:t xml:space="preserve">A plain-English template to build your first one today</w:t>
-      </w:r>
-    </w:p>
-    <w:bookmarkEnd w:id="20"/>
-    <w:bookmarkStart w:id="21" w:name="skills-used-in-this-video"/>
-    <w:p>
-      <w:pPr>
-        <w:pStyle w:val="Heading2"/>
-      </w:pPr>
-      <w:r>
-        <w:t xml:space="preserve">Skills used in this video</w:t>
+        <w:t xml:space="preserve">/transcribe - pulls the transcript from reference videos so you learn from what is proven</w:t>
+      </w:r>
+    </w:p>
+    <w:p>
+      <w:pPr>
+        <w:pStyle w:val="Compact"/>
+        <w:numPr>
+          <w:ilvl w:val="0"/>
+          <w:numId w:val="1001"/>
+        </w:numPr>
+      </w:pPr>
+      <w:r>
+        <w:t xml:space="preserve">/yt-package - writes the full package: titles, hooks, script, description, filming guide</w:t>
+      </w:r>
+    </w:p>
+    <w:p>
+      <w:pPr>
+        <w:pStyle w:val="Compact"/>
+        <w:numPr>
+          <w:ilvl w:val="0"/>
+          <w:numId w:val="1001"/>
+        </w:numPr>
+      </w:pPr>
+      <w:r>
+        <w:t xml:space="preserve">/yt-seo - optimizes the title, description, and tags against what is ranking</w:t>
+      </w:r>
+    </w:p>
+    <w:p>
+      <w:pPr>
+        <w:pStyle w:val="Compact"/>
+        <w:numPr>
+          <w:ilvl w:val="0"/>
+          <w:numId w:val="1001"/>
+        </w:numPr>
+      </w:pPr>
+      <w:r>
+        <w:t xml:space="preserve">/yt-shorts - turns the research into 5 short-form scripts plus 2 Instagram carousel outlines</w:t>
+      </w:r>
+    </w:p>
+    <w:p>
+      <w:pPr>
+        <w:pStyle w:val="Compact"/>
+        <w:numPr>
+          <w:ilvl w:val="0"/>
+          <w:numId w:val="1001"/>
+        </w:numPr>
+      </w:pPr>
+      <w:r>
+        <w:t xml:space="preserve">/social-copy - writes the LinkedIn post, X posts, Instagram caption, and YouTube Community post</w:t>
+      </w:r>
+    </w:p>
+    <w:p>
+      <w:pPr>
+        <w:pStyle w:val="Compact"/>
+        <w:numPr>
+          <w:ilvl w:val="0"/>
+          <w:numId w:val="1001"/>
+        </w:numPr>
+      </w:pPr>
+      <w:r>
+        <w:t xml:space="preserve">/yt-thumbnail - generates thumbnails with the Claude image models (Nano Banana)</w:t>
+      </w:r>
+    </w:p>
+    <w:p>
+      <w:pPr>
+        <w:pStyle w:val="Compact"/>
+        <w:numPr>
+          <w:ilvl w:val="0"/>
+          <w:numId w:val="1001"/>
+        </w:numPr>
+      </w:pPr>
+      <w:r>
+        <w:t xml:space="preserve">/yt-chapters - builds accurate chapters from the final edited video</w:t>
       </w:r>
     </w:p>
     <w:p>
@@ -105,605 +175,69 @@
         <w:pStyle w:val="FirstParagraph"/>
       </w:pPr>
       <w:r>
-        <w:t xml:space="preserve">These are custom Claude Code skills. A skill is just a workflow you taught Claude Code once, triggered with one command. Build it once, run it forever.</w:t>
-      </w:r>
-    </w:p>
-    <w:tbl>
-      <w:tblPr>
-        <w:tblStyle w:val="Table"/>
-        <w:tblW w:type="pct" w:w="5000"/>
-        <w:tblLayout w:type="fixed"/>
-        <w:tblLook w:firstRow="1" w:lastRow="0" w:firstColumn="0" w:lastColumn="0" w:noHBand="0" w:noVBand="0" w:val="0020"/>
-      </w:tblPr>
-      <w:tblGrid>
-        <w:gridCol w:w="3960"/>
-        <w:gridCol w:w="3960"/>
-      </w:tblGrid>
-      <w:tr>
-        <w:trPr>
-          <w:tblHeader w:val="on"/>
-        </w:trPr>
-        <w:tc>
-          <w:tcPr/>
-          <w:p>
-            <w:pPr>
-              <w:pStyle w:val="Compact"/>
-              <w:jc w:val="left"/>
-            </w:pPr>
-            <w:r>
-              <w:t xml:space="preserve">Skill</w:t>
-            </w:r>
-          </w:p>
-        </w:tc>
-        <w:tc>
-          <w:tcPr/>
-          <w:p>
-            <w:pPr>
-              <w:pStyle w:val="Compact"/>
-              <w:jc w:val="left"/>
-            </w:pPr>
-            <w:r>
-              <w:t xml:space="preserve">What it does</w:t>
-            </w:r>
-          </w:p>
-        </w:tc>
-      </w:tr>
-      <w:tr>
-        <w:tc>
-          <w:tcPr/>
-          <w:p>
-            <w:pPr>
-              <w:pStyle w:val="Compact"/>
-              <w:jc w:val="left"/>
-            </w:pPr>
-            <w:r>
-              <w:rPr>
-                <w:rStyle w:val="VerbatimChar"/>
-              </w:rPr>
-              <w:t xml:space="preserve">/yt-search</w:t>
-            </w:r>
-          </w:p>
-        </w:tc>
-        <w:tc>
-          <w:tcPr/>
-          <w:p>
-            <w:pPr>
-              <w:pStyle w:val="Compact"/>
-              <w:jc w:val="left"/>
-            </w:pPr>
-            <w:r>
-              <w:t xml:space="preserve">Researches what’s actually working on YouTube for a topic right now, ranks by views</w:t>
-            </w:r>
-          </w:p>
-        </w:tc>
-      </w:tr>
-      <w:tr>
-        <w:tc>
-          <w:tcPr/>
-          <w:p>
-            <w:pPr>
-              <w:pStyle w:val="Compact"/>
-              <w:jc w:val="left"/>
-            </w:pPr>
-            <w:r>
-              <w:rPr>
-                <w:rStyle w:val="VerbatimChar"/>
-              </w:rPr>
-              <w:t xml:space="preserve">/yt-deep-research</w:t>
-            </w:r>
-          </w:p>
-        </w:tc>
-        <w:tc>
-          <w:tcPr/>
-          <w:p>
-            <w:pPr>
-              <w:pStyle w:val="Compact"/>
-              <w:jc w:val="left"/>
-            </w:pPr>
-            <w:r>
-              <w:t xml:space="preserve">Searches YouTube, transcribes the top videos, returns a deep analysis of hooks and structure</w:t>
-            </w:r>
-          </w:p>
-        </w:tc>
-      </w:tr>
-      <w:tr>
-        <w:tc>
-          <w:tcPr/>
-          <w:p>
-            <w:pPr>
-              <w:pStyle w:val="Compact"/>
-              <w:jc w:val="left"/>
-            </w:pPr>
-            <w:r>
-              <w:rPr>
-                <w:rStyle w:val="VerbatimChar"/>
-              </w:rPr>
-              <w:t xml:space="preserve">/transcribe</w:t>
-            </w:r>
-          </w:p>
-        </w:tc>
-        <w:tc>
-          <w:tcPr/>
-          <w:p>
-            <w:pPr>
-              <w:pStyle w:val="Compact"/>
-              <w:jc w:val="left"/>
-            </w:pPr>
-            <w:r>
-              <w:t xml:space="preserve">Pulls the transcript from reference videos so you learn from what’s proven</w:t>
-            </w:r>
-          </w:p>
-        </w:tc>
-      </w:tr>
-      <w:tr>
-        <w:tc>
-          <w:tcPr/>
-          <w:p>
-            <w:pPr>
-              <w:pStyle w:val="Compact"/>
-              <w:jc w:val="left"/>
-            </w:pPr>
-            <w:r>
-              <w:rPr>
-                <w:rStyle w:val="VerbatimChar"/>
-              </w:rPr>
-              <w:t xml:space="preserve">/yt-package</w:t>
-            </w:r>
-          </w:p>
-        </w:tc>
-        <w:tc>
-          <w:tcPr/>
-          <w:p>
-            <w:pPr>
-              <w:pStyle w:val="Compact"/>
-              <w:jc w:val="left"/>
-            </w:pPr>
-            <w:r>
-              <w:t xml:space="preserve">Writes the full video package: titles, hooks, script, description, filming guide</w:t>
-            </w:r>
-          </w:p>
-        </w:tc>
-      </w:tr>
-      <w:tr>
-        <w:tc>
-          <w:tcPr/>
-          <w:p>
-            <w:pPr>
-              <w:pStyle w:val="Compact"/>
-              <w:jc w:val="left"/>
-            </w:pPr>
-            <w:r>
-              <w:rPr>
-                <w:rStyle w:val="VerbatimChar"/>
-              </w:rPr>
-              <w:t xml:space="preserve">/yt-seo</w:t>
-            </w:r>
-          </w:p>
-        </w:tc>
-        <w:tc>
-          <w:tcPr/>
-          <w:p>
-            <w:pPr>
-              <w:pStyle w:val="Compact"/>
-              <w:jc w:val="left"/>
-            </w:pPr>
-            <w:r>
-              <w:t xml:space="preserve">Optimizes the title, description, and tags against what’s ranking</w:t>
-            </w:r>
-          </w:p>
-        </w:tc>
-      </w:tr>
-      <w:tr>
-        <w:tc>
-          <w:tcPr/>
-          <w:p>
-            <w:pPr>
-              <w:pStyle w:val="Compact"/>
-              <w:jc w:val="left"/>
-            </w:pPr>
-            <w:r>
-              <w:rPr>
-                <w:rStyle w:val="VerbatimChar"/>
-              </w:rPr>
-              <w:t xml:space="preserve">/yt-shorts</w:t>
-            </w:r>
-          </w:p>
-        </w:tc>
-        <w:tc>
-          <w:tcPr/>
-          <w:p>
-            <w:pPr>
-              <w:pStyle w:val="Compact"/>
-              <w:jc w:val="left"/>
-            </w:pPr>
-            <w:r>
-              <w:t xml:space="preserve">Turns the research into 5 short-form scripts + 2 Instagram carousel outlines</w:t>
-            </w:r>
-          </w:p>
-        </w:tc>
-      </w:tr>
-      <w:tr>
-        <w:tc>
-          <w:tcPr/>
-          <w:p>
-            <w:pPr>
-              <w:pStyle w:val="Compact"/>
-              <w:jc w:val="left"/>
-            </w:pPr>
-            <w:r>
-              <w:rPr>
-                <w:rStyle w:val="VerbatimChar"/>
-              </w:rPr>
-              <w:t xml:space="preserve">/social-copy</w:t>
-            </w:r>
-          </w:p>
-        </w:tc>
-        <w:tc>
-          <w:tcPr/>
-          <w:p>
-            <w:pPr>
-              <w:pStyle w:val="Compact"/>
-              <w:jc w:val="left"/>
-            </w:pPr>
-            <w:r>
-              <w:t xml:space="preserve">Writes the LinkedIn post, X posts, Instagram caption, and YouTube Community post</w:t>
-            </w:r>
-          </w:p>
-        </w:tc>
-      </w:tr>
-      <w:tr>
-        <w:tc>
-          <w:tcPr/>
-          <w:p>
-            <w:pPr>
-              <w:pStyle w:val="Compact"/>
-              <w:jc w:val="left"/>
-            </w:pPr>
-            <w:r>
-              <w:rPr>
-                <w:rStyle w:val="VerbatimChar"/>
-              </w:rPr>
-              <w:t xml:space="preserve">/yt-thumbnail</w:t>
-            </w:r>
-          </w:p>
-        </w:tc>
-        <w:tc>
-          <w:tcPr/>
-          <w:p>
-            <w:pPr>
-              <w:pStyle w:val="Compact"/>
-              <w:jc w:val="left"/>
-            </w:pPr>
-            <w:r>
-              <w:t xml:space="preserve">Generates thumbnails with the Claude image models (Nano Banana)</w:t>
-            </w:r>
-          </w:p>
-        </w:tc>
-      </w:tr>
-      <w:tr>
-        <w:tc>
-          <w:tcPr/>
-          <w:p>
-            <w:pPr>
-              <w:pStyle w:val="Compact"/>
-              <w:jc w:val="left"/>
-            </w:pPr>
-            <w:r>
-              <w:rPr>
-                <w:rStyle w:val="VerbatimChar"/>
-              </w:rPr>
-              <w:t xml:space="preserve">/yt-chapters</w:t>
-            </w:r>
-          </w:p>
-        </w:tc>
-        <w:tc>
-          <w:tcPr/>
-          <w:p>
-            <w:pPr>
-              <w:pStyle w:val="Compact"/>
-              <w:jc w:val="left"/>
-            </w:pPr>
-            <w:r>
-              <w:t xml:space="preserve">Builds accurate chapters from the final edited video</w:t>
-            </w:r>
-          </w:p>
-        </w:tc>
-      </w:tr>
-    </w:tbl>
-    <w:bookmarkEnd w:id="21"/>
-    <w:bookmarkStart w:id="22" w:name="the-mental-model"/>
-    <w:p>
-      <w:pPr>
-        <w:pStyle w:val="Heading2"/>
-      </w:pPr>
-      <w:r>
+        <w:rPr>
+          <w:b/>
+          <w:bCs/>
+        </w:rPr>
         <w:t xml:space="preserve">The mental model</w:t>
       </w:r>
     </w:p>
     <w:p>
       <w:pPr>
-        <w:pStyle w:val="FirstParagraph"/>
-      </w:pPr>
-      <w:r>
-        <w:t xml:space="preserve">One research kickoff flows through the chain above and comes out as ~32 pieces of content for the week. You are not writing 32 things from scratch. You make one strong thing and let the pipeline reshape it for every platform, in your voice, using rules you set once.</w:t>
-      </w:r>
-    </w:p>
-    <w:bookmarkEnd w:id="22"/>
-    <w:bookmarkStart w:id="23" w:name="build-your-first-skill-the-template"/>
-    <w:p>
-      <w:pPr>
-        <w:pStyle w:val="Heading2"/>
-      </w:pPr>
-      <w:r>
-        <w:t xml:space="preserve">Build your first skill (the template)</w:t>
-      </w:r>
-    </w:p>
-    <w:p>
-      <w:pPr>
-        <w:pStyle w:val="FirstParagraph"/>
-      </w:pPr>
-      <w:r>
-        <w:t xml:space="preserve">Start with ONE annoying, repetitive thing you do every week. A skill is a folder with a</w:t>
-      </w:r>
-      <w:r>
-        <w:t xml:space="preserve"> </w:t>
-      </w:r>
+        <w:pStyle w:val="BodyText"/>
+      </w:pPr>
+      <w:r>
+        <w:t xml:space="preserve">One research kickoff flows through the chain above and comes out as about 32 pieces of content for the week. You are not writing 32 things from scratch. You make one strong thing and let the pipeline reshape it for every platform, in your voice, using rules you set once.</w:t>
+      </w:r>
+    </w:p>
+    <w:p>
+      <w:pPr>
+        <w:pStyle w:val="BodyText"/>
+      </w:pPr>
       <w:r>
         <w:rPr>
-          <w:rStyle w:val="VerbatimChar"/>
+          <w:b/>
+          <w:bCs/>
         </w:rPr>
-        <w:t xml:space="preserve">SKILL.md</w:t>
-      </w:r>
-      <w:r>
-        <w:t xml:space="preserve"> </w:t>
-      </w:r>
-      <w:r>
-        <w:t xml:space="preserve">file that describes the steps in plain English. Copy this and fill it in:</w:t>
-      </w:r>
-    </w:p>
-    <w:p>
-      <w:pPr>
-        <w:pStyle w:val="SourceCode"/>
+        <w:t xml:space="preserve">Build your first skill</w:t>
+      </w:r>
+    </w:p>
+    <w:p>
+      <w:pPr>
+        <w:pStyle w:val="BodyText"/>
+      </w:pPr>
+      <w:r>
+        <w:t xml:space="preserve">Start with one annoying, repetitive thing you do every week. A skill is a folder with a SKILL.md file that describes the steps in plain English: a name, a description of what it does, the steps to follow, and any rules it should always or never follow.</w:t>
+      </w:r>
+    </w:p>
+    <w:p>
+      <w:pPr>
+        <w:pStyle w:val="BodyText"/>
+      </w:pPr>
+      <w:r>
+        <w:t xml:space="preserve">If you can describe your process in plain English, you can build a skill. Then build the next one.</w:t>
+      </w:r>
+    </w:p>
+    <w:p>
+      <w:pPr>
+        <w:pStyle w:val="BodyText"/>
       </w:pPr>
       <w:r>
         <w:rPr>
-          <w:rStyle w:val="CommentTok"/>
+          <w:b/>
+          <w:bCs/>
         </w:rPr>
-        <w:t xml:space="preserve">---</w:t>
-      </w:r>
-      <w:r>
-        <w:br/>
-      </w:r>
-      <w:r>
-        <w:rPr>
-          <w:rStyle w:val="AnnotationTok"/>
-        </w:rPr>
-        <w:t xml:space="preserve">name:</w:t>
-      </w:r>
-      <w:r>
-        <w:rPr>
-          <w:rStyle w:val="CommentTok"/>
-        </w:rPr>
-        <w:t xml:space="preserve"> my-first-skill</w:t>
-      </w:r>
-      <w:r>
-        <w:br/>
-      </w:r>
-      <w:r>
-        <w:rPr>
-          <w:rStyle w:val="AnnotationTok"/>
-        </w:rPr>
-        <w:t xml:space="preserve">description:</w:t>
-      </w:r>
-      <w:r>
-        <w:rPr>
-          <w:rStyle w:val="CommentTok"/>
-        </w:rPr>
-        <w:t xml:space="preserve"> What this does and when to trigger it</w:t>
-      </w:r>
-      <w:r>
-        <w:br/>
-      </w:r>
-      <w:r>
-        <w:rPr>
-          <w:rStyle w:val="CommentTok"/>
-        </w:rPr>
-        <w:t xml:space="preserve">---</w:t>
-      </w:r>
-      <w:r>
-        <w:br/>
-      </w:r>
-      <w:r>
-        <w:br/>
-      </w:r>
-      <w:r>
-        <w:rPr>
-          <w:rStyle w:val="FunctionTok"/>
-        </w:rPr>
-        <w:t xml:space="preserve"># What this skill does</w:t>
-      </w:r>
-      <w:r>
-        <w:br/>
-      </w:r>
-      <w:r>
-        <w:rPr>
-          <w:rStyle w:val="CommentTok"/>
-        </w:rPr>
-        <w:t xml:space="preserve">[</w:t>
-      </w:r>
-      <w:r>
-        <w:rPr>
-          <w:rStyle w:val="OtherTok"/>
-        </w:rPr>
-        <w:t xml:space="preserve">One sentence.</w:t>
-      </w:r>
-      <w:r>
-        <w:rPr>
-          <w:rStyle w:val="CommentTok"/>
-        </w:rPr>
-        <w:t xml:space="preserve">]</w:t>
-      </w:r>
-      <w:r>
-        <w:br/>
-      </w:r>
-      <w:r>
-        <w:br/>
-      </w:r>
-      <w:r>
-        <w:rPr>
-          <w:rStyle w:val="FunctionTok"/>
-        </w:rPr>
-        <w:t xml:space="preserve"># Steps</w:t>
-      </w:r>
-      <w:r>
-        <w:br/>
-      </w:r>
-      <w:r>
-        <w:rPr>
-          <w:rStyle w:val="SpecialStringTok"/>
-        </w:rPr>
-        <w:t xml:space="preserve">1. </w:t>
-      </w:r>
-      <w:r>
-        <w:rPr>
-          <w:rStyle w:val="CommentTok"/>
-        </w:rPr>
-        <w:t xml:space="preserve">[</w:t>
-      </w:r>
-      <w:r>
-        <w:rPr>
-          <w:rStyle w:val="OtherTok"/>
-        </w:rPr>
-        <w:t xml:space="preserve">First thing to do</w:t>
-      </w:r>
-      <w:r>
-        <w:rPr>
-          <w:rStyle w:val="CommentTok"/>
-        </w:rPr>
-        <w:t xml:space="preserve">]</w:t>
-      </w:r>
-      <w:r>
-        <w:br/>
-      </w:r>
-      <w:r>
-        <w:rPr>
-          <w:rStyle w:val="SpecialStringTok"/>
-        </w:rPr>
-        <w:t xml:space="preserve">2. </w:t>
-      </w:r>
-      <w:r>
-        <w:rPr>
-          <w:rStyle w:val="CommentTok"/>
-        </w:rPr>
-        <w:t xml:space="preserve">[</w:t>
-      </w:r>
-      <w:r>
-        <w:rPr>
-          <w:rStyle w:val="OtherTok"/>
-        </w:rPr>
-        <w:t xml:space="preserve">Second thing</w:t>
-      </w:r>
-      <w:r>
-        <w:rPr>
-          <w:rStyle w:val="CommentTok"/>
-        </w:rPr>
-        <w:t xml:space="preserve">]</w:t>
-      </w:r>
-      <w:r>
-        <w:br/>
-      </w:r>
-      <w:r>
-        <w:rPr>
-          <w:rStyle w:val="SpecialStringTok"/>
-        </w:rPr>
-        <w:t xml:space="preserve">3. </w:t>
-      </w:r>
-      <w:r>
-        <w:rPr>
-          <w:rStyle w:val="CommentTok"/>
-        </w:rPr>
-        <w:t xml:space="preserve">[</w:t>
-      </w:r>
-      <w:r>
-        <w:rPr>
-          <w:rStyle w:val="OtherTok"/>
-        </w:rPr>
-        <w:t xml:space="preserve">Where to save the output</w:t>
-      </w:r>
-      <w:r>
-        <w:rPr>
-          <w:rStyle w:val="CommentTok"/>
-        </w:rPr>
-        <w:t xml:space="preserve">]</w:t>
-      </w:r>
-      <w:r>
-        <w:br/>
-      </w:r>
-      <w:r>
-        <w:br/>
-      </w:r>
-      <w:r>
-        <w:rPr>
-          <w:rStyle w:val="FunctionTok"/>
-        </w:rPr>
-        <w:t xml:space="preserve"># Rules</w:t>
-      </w:r>
-      <w:r>
-        <w:br/>
-      </w:r>
-      <w:r>
-        <w:rPr>
-          <w:rStyle w:val="SpecialStringTok"/>
-        </w:rPr>
-        <w:t xml:space="preserve">- </w:t>
-      </w:r>
-      <w:r>
-        <w:rPr>
-          <w:rStyle w:val="CommentTok"/>
-        </w:rPr>
-        <w:t xml:space="preserve">[</w:t>
-      </w:r>
-      <w:r>
-        <w:rPr>
-          <w:rStyle w:val="OtherTok"/>
-        </w:rPr>
-        <w:t xml:space="preserve">Anything it should always/never do</w:t>
-      </w:r>
-      <w:r>
-        <w:rPr>
-          <w:rStyle w:val="CommentTok"/>
-        </w:rPr>
-        <w:t xml:space="preserve">]</w:t>
-      </w:r>
-    </w:p>
-    <w:p>
-      <w:pPr>
-        <w:pStyle w:val="FirstParagraph"/>
-      </w:pPr>
-      <w:r>
-        <w:t xml:space="preserve">That’s it. If you can describe your process in plain English, you can build a skill. Then build the next one.</w:t>
-      </w:r>
-    </w:p>
-    <w:bookmarkEnd w:id="23"/>
-    <w:bookmarkStart w:id="24" w:name="start-here"/>
-    <w:p>
-      <w:pPr>
-        <w:pStyle w:val="Heading2"/>
-      </w:pPr>
-      <w:r>
         <w:t xml:space="preserve">Start here</w:t>
       </w:r>
     </w:p>
     <w:p>
       <w:pPr>
-        <w:pStyle w:val="FirstParagraph"/>
-      </w:pPr>
-      <w:r>
-        <w:t xml:space="preserve">Pick the most repetitive part of your week and teach Claude Code to do it once. The whole system above got built one skill at a time.</w:t>
-      </w:r>
-    </w:p>
-    <w:bookmarkEnd w:id="24"/>
-    <w:bookmarkEnd w:id="25"/>
+        <w:pStyle w:val="BodyText"/>
+      </w:pPr>
+      <w:r>
+        <w:t xml:space="preserve">Pick the most repetitive part of your week and teach Claude Code to do it once. The whole system got built one skill at a time.</w:t>
+      </w:r>
+    </w:p>
     <w:sectPr/>
   </w:body>
 </w:document>
@@ -810,114 +344,123 @@
       </w:pPr>
     </w:lvl>
   </w:abstractNum>
-  <w:abstractNum w:abstractNumId="991">
-    <w:nsid w:val="0000A991"/>
+  <w:abstractNum w:abstractNumId="99411">
+    <w:nsid w:val="00A99411"/>
     <w:multiLevelType w:val="multilevel"/>
     <w:lvl w:ilvl="0">
-      <w:numFmt w:val="bullet"/>
-      <w:lvlText w:val=""/>
+      <w:start w:val="1"/>
+      <w:numFmt w:val="decimal"/>
+      <w:lvlText w:val="%1."/>
       <w:lvlJc w:val="left"/>
       <w:pPr>
         <w:ind w:left="720" w:hanging="360"/>
       </w:pPr>
-      <w:rPr>
-        <w:rFonts w:ascii="Symbol" w:hAnsi="Symbol" w:cs="Symbol" w:hint="default"/>
-      </w:rPr>
     </w:lvl>
     <w:lvl w:ilvl="1">
-      <w:numFmt w:val="bullet"/>
-      <w:lvlText w:val="o"/>
+      <w:start w:val="1"/>
+      <w:numFmt w:val="decimal"/>
+      <w:lvlText w:val="%2."/>
       <w:lvlJc w:val="left"/>
       <w:pPr>
         <w:ind w:left="1440" w:hanging="360"/>
       </w:pPr>
-      <w:rPr>
-        <w:rFonts w:ascii="Courier New" w:hAnsi="Courier New" w:cs="Courier New" w:hint="default"/>
-      </w:rPr>
     </w:lvl>
     <w:lvl w:ilvl="2">
-      <w:numFmt w:val="bullet"/>
-      <w:lvlText w:val=""/>
+      <w:start w:val="1"/>
+      <w:numFmt w:val="decimal"/>
+      <w:lvlText w:val="%3."/>
       <w:lvlJc w:val="left"/>
       <w:pPr>
         <w:ind w:left="2160" w:hanging="360"/>
       </w:pPr>
-      <w:rPr>
-        <w:rFonts w:ascii="Wingdings" w:hAnsi="Wingdings" w:cs="Wingdings" w:hint="default"/>
-      </w:rPr>
     </w:lvl>
     <w:lvl w:ilvl="3">
-      <w:numFmt w:val="bullet"/>
-      <w:lvlText w:val=""/>
+      <w:start w:val="1"/>
+      <w:numFmt w:val="decimal"/>
+      <w:lvlText w:val="%4."/>
       <w:lvlJc w:val="left"/>
       <w:pPr>
         <w:ind w:left="2880" w:hanging="360"/>
       </w:pPr>
-      <w:rPr>
-        <w:rFonts w:ascii="Symbol" w:hAnsi="Symbol" w:cs="Symbol" w:hint="default"/>
-      </w:rPr>
     </w:lvl>
     <w:lvl w:ilvl="4">
-      <w:numFmt w:val="bullet"/>
-      <w:lvlText w:val="o"/>
+      <w:start w:val="1"/>
+      <w:numFmt w:val="decimal"/>
+      <w:lvlText w:val="%5."/>
       <w:lvlJc w:val="left"/>
       <w:pPr>
         <w:ind w:left="3600" w:hanging="360"/>
       </w:pPr>
-      <w:rPr>
-        <w:rFonts w:ascii="Courier New" w:hAnsi="Courier New" w:cs="Courier New" w:hint="default"/>
-      </w:rPr>
     </w:lvl>
     <w:lvl w:ilvl="5">
-      <w:numFmt w:val="bullet"/>
-      <w:lvlText w:val=""/>
+      <w:start w:val="1"/>
+      <w:numFmt w:val="decimal"/>
+      <w:lvlText w:val="%6."/>
       <w:lvlJc w:val="left"/>
       <w:pPr>
         <w:ind w:left="4320" w:hanging="360"/>
       </w:pPr>
-      <w:rPr>
-        <w:rFonts w:ascii="Wingdings" w:hAnsi="Wingdings" w:cs="Wingdings" w:hint="default"/>
-      </w:rPr>
     </w:lvl>
     <w:lvl w:ilvl="6">
-      <w:numFmt w:val="bullet"/>
-      <w:lvlText w:val=""/>
+      <w:start w:val="1"/>
+      <w:numFmt w:val="decimal"/>
+      <w:lvlText w:val="%7."/>
       <w:lvlJc w:val="left"/>
       <w:pPr>
         <w:ind w:left="5040" w:hanging="360"/>
       </w:pPr>
-      <w:rPr>
-        <w:rFonts w:ascii="Symbol" w:hAnsi="Symbol" w:cs="Symbol" w:hint="default"/>
-      </w:rPr>
     </w:lvl>
     <w:lvl w:ilvl="7">
-      <w:numFmt w:val="bullet"/>
-      <w:lvlText w:val="o"/>
+      <w:start w:val="1"/>
+      <w:numFmt w:val="decimal"/>
+      <w:lvlText w:val="%8."/>
       <w:lvlJc w:val="left"/>
       <w:pPr>
         <w:ind w:left="5760" w:hanging="360"/>
       </w:pPr>
-      <w:rPr>
-        <w:rFonts w:ascii="Courier New" w:hAnsi="Courier New" w:cs="Courier New" w:hint="default"/>
-      </w:rPr>
     </w:lvl>
     <w:lvl w:ilvl="8">
-      <w:numFmt w:val="bullet"/>
-      <w:lvlText w:val=""/>
+      <w:start w:val="1"/>
+      <w:numFmt w:val="decimal"/>
+      <w:lvlText w:val="%9."/>
       <w:lvlJc w:val="left"/>
       <w:pPr>
         <w:ind w:left="6480" w:hanging="360"/>
       </w:pPr>
-      <w:rPr>
-        <w:rFonts w:ascii="Wingdings" w:hAnsi="Wingdings" w:cs="Wingdings" w:hint="default"/>
-      </w:rPr>
     </w:lvl>
   </w:abstractNum>
   <w:num w:numId="1000">
     <w:abstractNumId w:val="990"/>
   </w:num>
   <w:num w:numId="1001">
-    <w:abstractNumId w:val="991"/>
+    <w:abstractNumId w:val="99411"/>
+    <w:lvlOverride w:ilvl="0">
+      <w:startOverride w:val="1"/>
+    </w:lvlOverride>
+    <w:lvlOverride w:ilvl="1">
+      <w:startOverride w:val="1"/>
+    </w:lvlOverride>
+    <w:lvlOverride w:ilvl="2">
+      <w:startOverride w:val="1"/>
+    </w:lvlOverride>
+    <w:lvlOverride w:ilvl="3">
+      <w:startOverride w:val="1"/>
+    </w:lvlOverride>
+    <w:lvlOverride w:ilvl="4">
+      <w:startOverride w:val="1"/>
+    </w:lvlOverride>
+    <w:lvlOverride w:ilvl="5">
+      <w:startOverride w:val="1"/>
+    </w:lvlOverride>
+    <w:lvlOverride w:ilvl="6">
+      <w:startOverride w:val="1"/>
+    </w:lvlOverride>
+    <w:lvlOverride w:ilvl="7">
+      <w:startOverride w:val="1"/>
+    </w:lvlOverride>
+    <w:lvlOverride w:ilvl="8">
+      <w:startOverride w:val="1"/>
+    </w:lvlOverride>
   </w:num>
 </w:numbering>
 </file>
@@ -930,7 +473,7 @@
         <w:rFonts w:asciiTheme="minorHAnsi" w:cstheme="minorBidi" w:eastAsiaTheme="minorHAnsi" w:hAnsiTheme="minorHAnsi"/>
         <w:sz w:val="24"/>
         <w:szCs w:val="24"/>
-        <w:lang w:bidi="ar-SA" w:eastAsia="en-US" w:val="en-US"/>
+        <w:lang w:bidi="ar-SA" w:eastAsia="Arial" w:val="en-US"/>
       </w:rPr>
     </w:rPrDefault>
     <w:pPrDefault>
@@ -1543,7 +1086,7 @@
     <w:name w:val="Verbatim Char"/>
     <w:basedOn w:val="BodyTextChar"/>
     <w:rPr>
-      <w:rFonts w:ascii="Consolas" w:hAnsi="Consolas"/>
+      <w:rFonts w:ascii="Arial" w:hAnsi="Arial"/>
       <w:sz w:val="22"/>
     </w:rPr>
   </w:style>
@@ -1863,108 +1406,108 @@
     </a:clrScheme>
     <a:fontScheme name="Office">
       <a:majorFont>
-        <a:latin typeface="Aptos Display" panose="02110004020202020204"/>
-        <a:ea typeface=""/>
-        <a:cs typeface=""/>
-        <a:font script="Jpan" typeface="游ゴシック Light"/>
-        <a:font script="Hang" typeface="맑은 고딕"/>
-        <a:font script="Hans" typeface="等线 Light"/>
-        <a:font script="Hant" typeface="新細明體"/>
-        <a:font script="Arab" typeface="Times New Roman"/>
-        <a:font script="Hebr" typeface="Times New Roman"/>
-        <a:font script="Thai" typeface="Angsana New"/>
-        <a:font script="Ethi" typeface="Nyala"/>
-        <a:font script="Beng" typeface="Vrinda"/>
-        <a:font script="Gujr" typeface="Shruti"/>
-        <a:font script="Khmr" typeface="MoolBoran"/>
-        <a:font script="Knda" typeface="Tunga"/>
-        <a:font script="Guru" typeface="Raavi"/>
-        <a:font script="Cans" typeface="Euphemia"/>
-        <a:font script="Cher" typeface="Plantagenet Cherokee"/>
-        <a:font script="Yiii" typeface="Microsoft Yi Baiti"/>
-        <a:font script="Tibt" typeface="Microsoft Himalaya"/>
-        <a:font script="Thaa" typeface="MV Boli"/>
-        <a:font script="Deva" typeface="Mangal"/>
-        <a:font script="Telu" typeface="Gautami"/>
-        <a:font script="Taml" typeface="Latha"/>
-        <a:font script="Syrc" typeface="Estrangelo Edessa"/>
-        <a:font script="Orya" typeface="Kalinga"/>
-        <a:font script="Mlym" typeface="Kartika"/>
-        <a:font script="Laoo" typeface="DokChampa"/>
-        <a:font script="Sinh" typeface="Iskoola Pota"/>
-        <a:font script="Mong" typeface="Mongolian Baiti"/>
-        <a:font script="Viet" typeface="Times New Roman"/>
-        <a:font script="Uigh" typeface="Microsoft Uighur"/>
-        <a:font script="Geor" typeface="Sylfaen"/>
+        <a:latin typeface="Arial" panose="02110004020202020204"/>
+        <a:ea typeface="Arial"/>
+        <a:cs typeface="Arial"/>
+        <a:font script="Jpan" typeface="Arial"/>
+        <a:font script="Hang" typeface="Arial"/>
+        <a:font script="Hans" typeface="Arial"/>
+        <a:font script="Hant" typeface="Arial"/>
+        <a:font script="Arab" typeface="Arial"/>
+        <a:font script="Hebr" typeface="Arial"/>
+        <a:font script="Thai" typeface="Arial"/>
+        <a:font script="Ethi" typeface="Arial"/>
+        <a:font script="Beng" typeface="Arial"/>
+        <a:font script="Gujr" typeface="Arial"/>
+        <a:font script="Khmr" typeface="Arial"/>
+        <a:font script="Knda" typeface="Arial"/>
+        <a:font script="Guru" typeface="Arial"/>
+        <a:font script="Cans" typeface="Arial"/>
+        <a:font script="Cher" typeface="Arial"/>
+        <a:font script="Yiii" typeface="Arial"/>
+        <a:font script="Tibt" typeface="Arial"/>
+        <a:font script="Thaa" typeface="Arial"/>
+        <a:font script="Deva" typeface="Arial"/>
+        <a:font script="Telu" typeface="Arial"/>
+        <a:font script="Taml" typeface="Arial"/>
+        <a:font script="Syrc" typeface="Arial"/>
+        <a:font script="Orya" typeface="Arial"/>
+        <a:font script="Mlym" typeface="Arial"/>
+        <a:font script="Laoo" typeface="Arial"/>
+        <a:font script="Sinh" typeface="Arial"/>
+        <a:font script="Mong" typeface="Arial"/>
+        <a:font script="Viet" typeface="Arial"/>
+        <a:font script="Uigh" typeface="Arial"/>
+        <a:font script="Geor" typeface="Arial"/>
         <a:font script="Armn" typeface="Arial"/>
-        <a:font script="Bugi" typeface="Leelawadee UI"/>
-        <a:font script="Bopo" typeface="Microsoft JhengHei"/>
-        <a:font script="Java" typeface="Javanese Text"/>
-        <a:font script="Lisu" typeface="Segoe UI"/>
-        <a:font script="Mymr" typeface="Myanmar Text"/>
-        <a:font script="Nkoo" typeface="Ebrima"/>
-        <a:font script="Olck" typeface="Nirmala UI"/>
-        <a:font script="Osma" typeface="Ebrima"/>
-        <a:font script="Phag" typeface="Phagspa"/>
-        <a:font script="Syrn" typeface="Estrangelo Edessa"/>
-        <a:font script="Syrj" typeface="Estrangelo Edessa"/>
-        <a:font script="Syre" typeface="Estrangelo Edessa"/>
-        <a:font script="Sora" typeface="Nirmala UI"/>
-        <a:font script="Tale" typeface="Microsoft Tai Le"/>
-        <a:font script="Talu" typeface="Microsoft New Tai Lue"/>
-        <a:font script="Tfng" typeface="Ebrima"/>
+        <a:font script="Bugi" typeface="Arial"/>
+        <a:font script="Bopo" typeface="Arial"/>
+        <a:font script="Java" typeface="Arial"/>
+        <a:font script="Lisu" typeface="Arial"/>
+        <a:font script="Mymr" typeface="Arial"/>
+        <a:font script="Nkoo" typeface="Arial"/>
+        <a:font script="Olck" typeface="Arial"/>
+        <a:font script="Osma" typeface="Arial"/>
+        <a:font script="Phag" typeface="Arial"/>
+        <a:font script="Syrn" typeface="Arial"/>
+        <a:font script="Syrj" typeface="Arial"/>
+        <a:font script="Syre" typeface="Arial"/>
+        <a:font script="Sora" typeface="Arial"/>
+        <a:font script="Tale" typeface="Arial"/>
+        <a:font script="Talu" typeface="Arial"/>
+        <a:font script="Tfng" typeface="Arial"/>
       </a:majorFont>
       <a:minorFont>
-        <a:latin typeface="Aptos" panose="02110004020202020204"/>
-        <a:ea typeface=""/>
-        <a:cs typeface=""/>
-        <a:font script="Jpan" typeface="游明朝"/>
-        <a:font script="Hang" typeface="맑은 고딕"/>
-        <a:font script="Hans" typeface="等线"/>
-        <a:font script="Hant" typeface="新細明體"/>
+        <a:latin typeface="Arial" panose="02110004020202020204"/>
+        <a:ea typeface="Arial"/>
+        <a:cs typeface="Arial"/>
+        <a:font script="Jpan" typeface="Arial"/>
+        <a:font script="Hang" typeface="Arial"/>
+        <a:font script="Hans" typeface="Arial"/>
+        <a:font script="Hant" typeface="Arial"/>
         <a:font script="Arab" typeface="Arial"/>
         <a:font script="Hebr" typeface="Arial"/>
-        <a:font script="Thai" typeface="Cordia New"/>
-        <a:font script="Ethi" typeface="Nyala"/>
-        <a:font script="Beng" typeface="Vrinda"/>
-        <a:font script="Gujr" typeface="Shruti"/>
-        <a:font script="Khmr" typeface="DaunPenh"/>
-        <a:font script="Knda" typeface="Tunga"/>
-        <a:font script="Guru" typeface="Raavi"/>
-        <a:font script="Cans" typeface="Euphemia"/>
-        <a:font script="Cher" typeface="Plantagenet Cherokee"/>
-        <a:font script="Yiii" typeface="Microsoft Yi Baiti"/>
-        <a:font script="Tibt" typeface="Microsoft Himalaya"/>
-        <a:font script="Thaa" typeface="MV Boli"/>
-        <a:font script="Deva" typeface="Mangal"/>
-        <a:font script="Telu" typeface="Gautami"/>
-        <a:font script="Taml" typeface="Latha"/>
-        <a:font script="Syrc" typeface="Estrangelo Edessa"/>
-        <a:font script="Orya" typeface="Kalinga"/>
-        <a:font script="Mlym" typeface="Kartika"/>
-        <a:font script="Laoo" typeface="DokChampa"/>
-        <a:font script="Sinh" typeface="Iskoola Pota"/>
-        <a:font script="Mong" typeface="Mongolian Baiti"/>
+        <a:font script="Thai" typeface="Arial"/>
+        <a:font script="Ethi" typeface="Arial"/>
+        <a:font script="Beng" typeface="Arial"/>
+        <a:font script="Gujr" typeface="Arial"/>
+        <a:font script="Khmr" typeface="Arial"/>
+        <a:font script="Knda" typeface="Arial"/>
+        <a:font script="Guru" typeface="Arial"/>
+        <a:font script="Cans" typeface="Arial"/>
+        <a:font script="Cher" typeface="Arial"/>
+        <a:font script="Yiii" typeface="Arial"/>
+        <a:font script="Tibt" typeface="Arial"/>
+        <a:font script="Thaa" typeface="Arial"/>
+        <a:font script="Deva" typeface="Arial"/>
+        <a:font script="Telu" typeface="Arial"/>
+        <a:font script="Taml" typeface="Arial"/>
+        <a:font script="Syrc" typeface="Arial"/>
+        <a:font script="Orya" typeface="Arial"/>
+        <a:font script="Mlym" typeface="Arial"/>
+        <a:font script="Laoo" typeface="Arial"/>
+        <a:font script="Sinh" typeface="Arial"/>
+        <a:font script="Mong" typeface="Arial"/>
         <a:font script="Viet" typeface="Arial"/>
-        <a:font script="Uigh" typeface="Microsoft Uighur"/>
-        <a:font script="Geor" typeface="Sylfaen"/>
+        <a:font script="Uigh" typeface="Arial"/>
+        <a:font script="Geor" typeface="Arial"/>
         <a:font script="Armn" typeface="Arial"/>
-        <a:font script="Bugi" typeface="Leelawadee UI"/>
-        <a:font script="Bopo" typeface="Microsoft JhengHei"/>
-        <a:font script="Java" typeface="Javanese Text"/>
-        <a:font script="Lisu" typeface="Segoe UI"/>
-        <a:font script="Mymr" typeface="Myanmar Text"/>
-        <a:font script="Nkoo" typeface="Ebrima"/>
-        <a:font script="Olck" typeface="Nirmala UI"/>
-        <a:font script="Osma" typeface="Ebrima"/>
-        <a:font script="Phag" typeface="Phagspa"/>
-        <a:font script="Syrn" typeface="Estrangelo Edessa"/>
-        <a:font script="Syrj" typeface="Estrangelo Edessa"/>
-        <a:font script="Syre" typeface="Estrangelo Edessa"/>
-        <a:font script="Sora" typeface="Nirmala UI"/>
-        <a:font script="Tale" typeface="Microsoft Tai Le"/>
-        <a:font script="Talu" typeface="Microsoft New Tai Lue"/>
-        <a:font script="Tfng" typeface="Ebrima"/>
+        <a:font script="Bugi" typeface="Arial"/>
+        <a:font script="Bopo" typeface="Arial"/>
+        <a:font script="Java" typeface="Arial"/>
+        <a:font script="Lisu" typeface="Arial"/>
+        <a:font script="Mymr" typeface="Arial"/>
+        <a:font script="Nkoo" typeface="Arial"/>
+        <a:font script="Olck" typeface="Arial"/>
+        <a:font script="Osma" typeface="Arial"/>
+        <a:font script="Phag" typeface="Arial"/>
+        <a:font script="Syrn" typeface="Arial"/>
+        <a:font script="Syrj" typeface="Arial"/>
+        <a:font script="Syre" typeface="Arial"/>
+        <a:font script="Sora" typeface="Arial"/>
+        <a:font script="Tale" typeface="Arial"/>
+        <a:font script="Talu" typeface="Arial"/>
+        <a:font script="Tfng" typeface="Arial"/>
       </a:minorFont>
     </a:fontScheme>
     <a:fmtScheme name="Office">

</xml_diff>